<commit_message>
Paary Systems and health system
added Parry Systems and Health System to the game
</commit_message>
<xml_diff>
--- a/GameDesignDocument/Rebellion menu desgin.docx
+++ b/GameDesignDocument/Rebellion menu desgin.docx
@@ -1425,6 +1425,76 @@
           </w:p>
         </w:tc>
       </w:tr>
+      <w:tr>
+        <w:trPr>
+          <w:cnfStyle w:val="000000100000" w:firstRow="0" w:lastRow="0" w:firstColumn="0" w:lastColumn="0" w:oddVBand="0" w:evenVBand="0" w:oddHBand="1" w:evenHBand="0" w:firstRowFirstColumn="0" w:firstRowLastColumn="0" w:lastRowFirstColumn="0" w:lastRowLastColumn="0"/>
+        </w:trPr>
+        <w:tc>
+          <w:tcPr>
+            <w:cnfStyle w:val="001000000000" w:firstRow="0" w:lastRow="0" w:firstColumn="1" w:lastColumn="0" w:oddVBand="0" w:evenVBand="0" w:oddHBand="0" w:evenHBand="0" w:firstRowFirstColumn="0" w:firstRowLastColumn="0" w:lastRowFirstColumn="0" w:lastRowLastColumn="0"/>
+            <w:tcW w:w="3005" w:type="dxa"/>
+          </w:tcPr>
+          <w:p>
+            <w:pPr>
+              <w:rPr>
+                <w:rFonts w:ascii="Arial Black" w:hAnsi="Arial Black"/>
+              </w:rPr>
+            </w:pPr>
+            <w:r>
+              <w:rPr>
+                <w:rFonts w:ascii="Arial Black" w:hAnsi="Arial Black"/>
+              </w:rPr>
+              <w:t xml:space="preserve">Grab </w:t>
+            </w:r>
+          </w:p>
+        </w:tc>
+        <w:tc>
+          <w:tcPr>
+            <w:tcW w:w="3005" w:type="dxa"/>
+          </w:tcPr>
+          <w:p>
+            <w:pPr>
+              <w:cnfStyle w:val="000000100000" w:firstRow="0" w:lastRow="0" w:firstColumn="0" w:lastColumn="0" w:oddVBand="0" w:evenVBand="0" w:oddHBand="1" w:evenHBand="0" w:firstRowFirstColumn="0" w:firstRowLastColumn="0" w:lastRowFirstColumn="0" w:lastRowLastColumn="0"/>
+              <w:rPr>
+                <w:rFonts w:ascii="Arial Black" w:hAnsi="Arial Black"/>
+                <w:b/>
+                <w:bCs/>
+              </w:rPr>
+            </w:pPr>
+            <w:r>
+              <w:rPr>
+                <w:rFonts w:ascii="Arial Black" w:hAnsi="Arial Black"/>
+                <w:b/>
+                <w:bCs/>
+              </w:rPr>
+              <w:t>G</w:t>
+            </w:r>
+          </w:p>
+        </w:tc>
+        <w:tc>
+          <w:tcPr>
+            <w:tcW w:w="3006" w:type="dxa"/>
+          </w:tcPr>
+          <w:p>
+            <w:pPr>
+              <w:cnfStyle w:val="000000100000" w:firstRow="0" w:lastRow="0" w:firstColumn="0" w:lastColumn="0" w:oddVBand="0" w:evenVBand="0" w:oddHBand="1" w:evenHBand="0" w:firstRowFirstColumn="0" w:firstRowLastColumn="0" w:lastRowFirstColumn="0" w:lastRowLastColumn="0"/>
+              <w:rPr>
+                <w:rFonts w:ascii="Arial Black" w:hAnsi="Arial Black"/>
+                <w:b/>
+                <w:bCs/>
+              </w:rPr>
+            </w:pPr>
+            <w:r>
+              <w:rPr>
+                <w:rFonts w:ascii="Arial Black" w:hAnsi="Arial Black"/>
+                <w:b/>
+                <w:bCs/>
+              </w:rPr>
+              <w:t>H</w:t>
+            </w:r>
+          </w:p>
+        </w:tc>
+      </w:tr>
     </w:tbl>
     <w:p>
       <w:pPr>
@@ -2241,7 +2311,25 @@
           <w:b/>
           <w:bCs/>
         </w:rPr>
-        <w:t>Selection: tween rotation to 0 and x +10px (about 100 ms); swap to the bright colour variant.</w:t>
+        <w:t xml:space="preserve">Selection: tween rotation to 0 and x +10px (about 100 </w:t>
+      </w:r>
+      <w:proofErr w:type="spellStart"/>
+      <w:r>
+        <w:rPr>
+          <w:rFonts w:ascii="Arial Black" w:hAnsi="Arial Black"/>
+          <w:b/>
+          <w:bCs/>
+        </w:rPr>
+        <w:t>ms</w:t>
+      </w:r>
+      <w:proofErr w:type="spellEnd"/>
+      <w:r>
+        <w:rPr>
+          <w:rFonts w:ascii="Arial Black" w:hAnsi="Arial Black"/>
+          <w:b/>
+          <w:bCs/>
+        </w:rPr>
+        <w:t>); swap to the bright colour variant.</w:t>
       </w:r>
     </w:p>
     <w:p>

</xml_diff>

<commit_message>
level 1 re work and music at the end
added music at the end level clear and did some level rework
</commit_message>
<xml_diff>
--- a/GameDesignDocument/Rebellion menu desgin.docx
+++ b/GameDesignDocument/Rebellion menu desgin.docx
@@ -775,6 +775,14 @@
         </w:rPr>
         <w:t>Menu elements</w:t>
       </w:r>
+      <w:r>
+        <w:rPr>
+          <w:rFonts w:ascii="Arial Black" w:hAnsi="Arial Black"/>
+          <w:b/>
+          <w:bCs/>
+        </w:rPr>
+        <w:t>(keyboard)q</w:t>
+      </w:r>
     </w:p>
     <w:tbl>
       <w:tblPr>
@@ -991,7 +999,25 @@
                 <w:b/>
                 <w:bCs/>
               </w:rPr>
-              <w:t xml:space="preserve">Up arrow key board </w:t>
+              <w:t xml:space="preserve">Up arrow </w:t>
+            </w:r>
+            <w:proofErr w:type="gramStart"/>
+            <w:r>
+              <w:rPr>
+                <w:rFonts w:ascii="Arial Black" w:hAnsi="Arial Black"/>
+                <w:b/>
+                <w:bCs/>
+              </w:rPr>
+              <w:t>key board</w:t>
+            </w:r>
+            <w:proofErr w:type="gramEnd"/>
+            <w:r>
+              <w:rPr>
+                <w:rFonts w:ascii="Arial Black" w:hAnsi="Arial Black"/>
+                <w:b/>
+                <w:bCs/>
+              </w:rPr>
+              <w:t xml:space="preserve"> </w:t>
             </w:r>
           </w:p>
         </w:tc>
@@ -1158,13 +1184,7 @@
               <w:rPr>
                 <w:rFonts w:ascii="Arial Black" w:hAnsi="Arial Black"/>
               </w:rPr>
-              <w:t>Dod</w:t>
-            </w:r>
-            <w:r>
-              <w:rPr>
-                <w:rFonts w:ascii="Arial Black" w:hAnsi="Arial Black"/>
-              </w:rPr>
-              <w:t>ge</w:t>
+              <w:t>Special  Move</w:t>
             </w:r>
           </w:p>
         </w:tc>
@@ -1421,76 +1441,6 @@
                 <w:bCs/>
               </w:rPr>
               <w:t>V</w:t>
-            </w:r>
-          </w:p>
-        </w:tc>
-      </w:tr>
-      <w:tr>
-        <w:trPr>
-          <w:cnfStyle w:val="000000100000" w:firstRow="0" w:lastRow="0" w:firstColumn="0" w:lastColumn="0" w:oddVBand="0" w:evenVBand="0" w:oddHBand="1" w:evenHBand="0" w:firstRowFirstColumn="0" w:firstRowLastColumn="0" w:lastRowFirstColumn="0" w:lastRowLastColumn="0"/>
-        </w:trPr>
-        <w:tc>
-          <w:tcPr>
-            <w:cnfStyle w:val="001000000000" w:firstRow="0" w:lastRow="0" w:firstColumn="1" w:lastColumn="0" w:oddVBand="0" w:evenVBand="0" w:oddHBand="0" w:evenHBand="0" w:firstRowFirstColumn="0" w:firstRowLastColumn="0" w:lastRowFirstColumn="0" w:lastRowLastColumn="0"/>
-            <w:tcW w:w="3005" w:type="dxa"/>
-          </w:tcPr>
-          <w:p>
-            <w:pPr>
-              <w:rPr>
-                <w:rFonts w:ascii="Arial Black" w:hAnsi="Arial Black"/>
-              </w:rPr>
-            </w:pPr>
-            <w:r>
-              <w:rPr>
-                <w:rFonts w:ascii="Arial Black" w:hAnsi="Arial Black"/>
-              </w:rPr>
-              <w:t xml:space="preserve">Grab </w:t>
-            </w:r>
-          </w:p>
-        </w:tc>
-        <w:tc>
-          <w:tcPr>
-            <w:tcW w:w="3005" w:type="dxa"/>
-          </w:tcPr>
-          <w:p>
-            <w:pPr>
-              <w:cnfStyle w:val="000000100000" w:firstRow="0" w:lastRow="0" w:firstColumn="0" w:lastColumn="0" w:oddVBand="0" w:evenVBand="0" w:oddHBand="1" w:evenHBand="0" w:firstRowFirstColumn="0" w:firstRowLastColumn="0" w:lastRowFirstColumn="0" w:lastRowLastColumn="0"/>
-              <w:rPr>
-                <w:rFonts w:ascii="Arial Black" w:hAnsi="Arial Black"/>
-                <w:b/>
-                <w:bCs/>
-              </w:rPr>
-            </w:pPr>
-            <w:r>
-              <w:rPr>
-                <w:rFonts w:ascii="Arial Black" w:hAnsi="Arial Black"/>
-                <w:b/>
-                <w:bCs/>
-              </w:rPr>
-              <w:t>G</w:t>
-            </w:r>
-          </w:p>
-        </w:tc>
-        <w:tc>
-          <w:tcPr>
-            <w:tcW w:w="3006" w:type="dxa"/>
-          </w:tcPr>
-          <w:p>
-            <w:pPr>
-              <w:cnfStyle w:val="000000100000" w:firstRow="0" w:lastRow="0" w:firstColumn="0" w:lastColumn="0" w:oddVBand="0" w:evenVBand="0" w:oddHBand="1" w:evenHBand="0" w:firstRowFirstColumn="0" w:firstRowLastColumn="0" w:lastRowFirstColumn="0" w:lastRowLastColumn="0"/>
-              <w:rPr>
-                <w:rFonts w:ascii="Arial Black" w:hAnsi="Arial Black"/>
-                <w:b/>
-                <w:bCs/>
-              </w:rPr>
-            </w:pPr>
-            <w:r>
-              <w:rPr>
-                <w:rFonts w:ascii="Arial Black" w:hAnsi="Arial Black"/>
-                <w:b/>
-                <w:bCs/>
-              </w:rPr>
-              <w:t>H</w:t>
             </w:r>
           </w:p>
         </w:tc>
@@ -2229,7 +2179,25 @@
           <w:b/>
           <w:bCs/>
         </w:rPr>
-        <w:t>Palette: brick red #9C3B2E / #7A2F25, mustard #E1A92B, forest green #2F5D3A, warm brown #6B4A2F, cream #E8DCC0, near-black #1D1A16.</w:t>
+        <w:t xml:space="preserve">Palette: brick red #9C3B2E / #7A2F25, mustard #E1A92B, forest green #2F5D3A, warm brown #6B4A2F, cream #E8DCC0, </w:t>
+      </w:r>
+      <w:proofErr w:type="gramStart"/>
+      <w:r>
+        <w:rPr>
+          <w:rFonts w:ascii="Arial Black" w:hAnsi="Arial Black"/>
+          <w:b/>
+          <w:bCs/>
+        </w:rPr>
+        <w:t>near-black</w:t>
+      </w:r>
+      <w:proofErr w:type="gramEnd"/>
+      <w:r>
+        <w:rPr>
+          <w:rFonts w:ascii="Arial Black" w:hAnsi="Arial Black"/>
+          <w:b/>
+          <w:bCs/>
+        </w:rPr>
+        <w:t> #1D1A16.</w:t>
       </w:r>
     </w:p>
     <w:p>

</xml_diff>